<commit_message>
Lab_03: docstrings, pure-update methods on frozen classes, canonical test names
</commit_message>
<xml_diff>
--- a/Lab_03/report/Lab_03.docx
+++ b/Lab_03/report/Lab_03.docx
@@ -514,7 +514,7 @@
         <w:t xml:space="preserve">2. Pure-оновлення (core.py). </w:t>
       </w:r>
       <w:r>
-        <w:t>Функції restock, ship, change_price, add_tag, remove_tag, update_supplier повертають нові об’єкти через dataclasses.replace, конкатенацію tuple та операції frozenset. Правило знижок make_category_discount + apply_price_rule повертає новий кортеж записів, reorder_cost кешується через lru_cache.</w:t>
+        <w:t>Функції restock, ship, change_price, add_tag, remove_tag, update_supplier повертають нові об’єкти через dataclasses.replace, конкатенацію tuple та операції frozenset; базові методи with_price, with_tag, with_movement визначені прямо в frozen-класах. Правило знижок make_category_discount + apply_price_rule повертає новий кортеж записів, reorder_cost кешується через lru_cache.</w:t>
       </w:r>
     </w:p>
     <w:p>
@@ -544,7 +544,7 @@
         <w:t xml:space="preserve">4. Тести та вимірювання. </w:t>
       </w:r>
       <w:r>
-        <w:t>22 pytest-тести перевіряють немутацію, read-only поведінку, FrozenInstanceError, коректність нових копій, хешованість і кеш. Час порівняно через --durations=5 та pytest-benchmark: стара мутабельна модель (mutable_model.py) проти нової.</w:t>
+        <w:t>24 pytest-тести перевіряють немутацію, read-only поведінку, FrozenInstanceError, коректність нових копій, хешованість і кеш. Час порівняно через --durations=5 та pytest-benchmark: стара мутабельна модель (mutable_model.py) проти нової.</w:t>
       </w:r>
     </w:p>
     <w:p>
@@ -566,7 +566,7 @@
       <w:r>
         <w:drawing>
           <wp:inline xmlns:a="http://schemas.openxmlformats.org/drawingml/2006/main" xmlns:pic="http://schemas.openxmlformats.org/drawingml/2006/picture">
-            <wp:extent cx="5651080" cy="8459999"/>
+            <wp:extent cx="5760000" cy="6255484"/>
             <wp:docPr id="1" name="Picture 1"/>
             <wp:cNvGraphicFramePr>
               <a:graphicFrameLocks noChangeAspect="1"/>
@@ -575,7 +575,7 @@
               <a:graphicData uri="http://schemas.openxmlformats.org/drawingml/2006/picture">
                 <pic:pic>
                   <pic:nvPicPr>
-                    <pic:cNvPr id="0" name="model.py.png"/>
+                    <pic:cNvPr id="0" name="model.py_1.png"/>
                     <pic:cNvPicPr/>
                   </pic:nvPicPr>
                   <pic:blipFill>
@@ -587,7 +587,7 @@
                   <pic:spPr>
                     <a:xfrm>
                       <a:off x="0" y="0"/>
-                      <a:ext cx="5651080" cy="8459999"/>
+                      <a:ext cx="5760000" cy="6255484"/>
                     </a:xfrm>
                     <a:prstGeom prst="rect"/>
                   </pic:spPr>
@@ -610,7 +610,7 @@
           <w:i/>
           <w:sz w:val="24"/>
         </w:rPr>
-        <w:t>Рис. 1 – Незмінна модель model.py</w:t>
+        <w:t>Рис. 1 – Незмінна модель model.py (частина 1)</w:t>
       </w:r>
     </w:p>
     <w:p>
@@ -620,7 +620,7 @@
       <w:r>
         <w:drawing>
           <wp:inline xmlns:a="http://schemas.openxmlformats.org/drawingml/2006/main" xmlns:pic="http://schemas.openxmlformats.org/drawingml/2006/picture">
-            <wp:extent cx="5760000" cy="6686897"/>
+            <wp:extent cx="5760000" cy="5782737"/>
             <wp:docPr id="2" name="Picture 2"/>
             <wp:cNvGraphicFramePr>
               <a:graphicFrameLocks noChangeAspect="1"/>
@@ -629,7 +629,7 @@
               <a:graphicData uri="http://schemas.openxmlformats.org/drawingml/2006/picture">
                 <pic:pic>
                   <pic:nvPicPr>
-                    <pic:cNvPr id="0" name="core.py_1.png"/>
+                    <pic:cNvPr id="0" name="model.py_2.png"/>
                     <pic:cNvPicPr/>
                   </pic:nvPicPr>
                   <pic:blipFill>
@@ -641,7 +641,7 @@
                   <pic:spPr>
                     <a:xfrm>
                       <a:off x="0" y="0"/>
-                      <a:ext cx="5760000" cy="6686897"/>
+                      <a:ext cx="5760000" cy="5782737"/>
                     </a:xfrm>
                     <a:prstGeom prst="rect"/>
                   </pic:spPr>
@@ -664,7 +664,7 @@
           <w:i/>
           <w:sz w:val="24"/>
         </w:rPr>
-        <w:t>Рис. 2 – Pure-оновлення core.py (частина 1)</w:t>
+        <w:t>Рис. 2 – Методи pure-оновлення StockRecord у model.py (частина 2)</w:t>
       </w:r>
     </w:p>
     <w:p>
@@ -674,7 +674,7 @@
       <w:r>
         <w:drawing>
           <wp:inline xmlns:a="http://schemas.openxmlformats.org/drawingml/2006/main" xmlns:pic="http://schemas.openxmlformats.org/drawingml/2006/picture">
-            <wp:extent cx="5760000" cy="4191158"/>
+            <wp:extent cx="5760000" cy="6274286"/>
             <wp:docPr id="3" name="Picture 3"/>
             <wp:cNvGraphicFramePr>
               <a:graphicFrameLocks noChangeAspect="1"/>
@@ -683,7 +683,7 @@
               <a:graphicData uri="http://schemas.openxmlformats.org/drawingml/2006/picture">
                 <pic:pic>
                   <pic:nvPicPr>
-                    <pic:cNvPr id="0" name="core.py_2.png"/>
+                    <pic:cNvPr id="0" name="core.py_1.png"/>
                     <pic:cNvPicPr/>
                   </pic:nvPicPr>
                   <pic:blipFill>
@@ -695,7 +695,7 @@
                   <pic:spPr>
                     <a:xfrm>
                       <a:off x="0" y="0"/>
-                      <a:ext cx="5760000" cy="4191158"/>
+                      <a:ext cx="5760000" cy="6274286"/>
                     </a:xfrm>
                     <a:prstGeom prst="rect"/>
                   </pic:spPr>
@@ -718,7 +718,7 @@
           <w:i/>
           <w:sz w:val="24"/>
         </w:rPr>
-        <w:t>Рис. 3 – Бізнес-функції, правило знижок і lru_cache у core.py (частина 2)</w:t>
+        <w:t>Рис. 3 – Pure-оновлення core.py (частина 1)</w:t>
       </w:r>
     </w:p>
     <w:p>
@@ -728,7 +728,7 @@
       <w:r>
         <w:drawing>
           <wp:inline xmlns:a="http://schemas.openxmlformats.org/drawingml/2006/main" xmlns:pic="http://schemas.openxmlformats.org/drawingml/2006/picture">
-            <wp:extent cx="5760000" cy="7628764"/>
+            <wp:extent cx="5760000" cy="5100632"/>
             <wp:docPr id="4" name="Picture 4"/>
             <wp:cNvGraphicFramePr>
               <a:graphicFrameLocks noChangeAspect="1"/>
@@ -737,7 +737,7 @@
               <a:graphicData uri="http://schemas.openxmlformats.org/drawingml/2006/picture">
                 <pic:pic>
                   <pic:nvPicPr>
-                    <pic:cNvPr id="0" name="tests_test_immutability.py_part.png"/>
+                    <pic:cNvPr id="0" name="core.py_2.png"/>
                     <pic:cNvPicPr/>
                   </pic:nvPicPr>
                   <pic:blipFill>
@@ -749,7 +749,7 @@
                   <pic:spPr>
                     <a:xfrm>
                       <a:off x="0" y="0"/>
-                      <a:ext cx="5760000" cy="7628764"/>
+                      <a:ext cx="5760000" cy="5100632"/>
                     </a:xfrm>
                     <a:prstGeom prst="rect"/>
                   </pic:spPr>
@@ -772,7 +772,7 @@
           <w:i/>
           <w:sz w:val="24"/>
         </w:rPr>
-        <w:t>Рис. 4 – Тести на немутацію, read-only та хешованість (фрагмент)</w:t>
+        <w:t>Рис. 4 – Бізнес-функції, правило знижок і lru_cache у core.py (частина 2)</w:t>
       </w:r>
     </w:p>
     <w:p>
@@ -782,7 +782,7 @@
       <w:r>
         <w:drawing>
           <wp:inline xmlns:a="http://schemas.openxmlformats.org/drawingml/2006/main" xmlns:pic="http://schemas.openxmlformats.org/drawingml/2006/picture">
-            <wp:extent cx="5760000" cy="7108085"/>
+            <wp:extent cx="5760000" cy="8206364"/>
             <wp:docPr id="5" name="Picture 5"/>
             <wp:cNvGraphicFramePr>
               <a:graphicFrameLocks noChangeAspect="1"/>
@@ -791,7 +791,7 @@
               <a:graphicData uri="http://schemas.openxmlformats.org/drawingml/2006/picture">
                 <pic:pic>
                   <pic:nvPicPr>
-                    <pic:cNvPr id="0" name="tests_test_performance.py.png"/>
+                    <pic:cNvPr id="0" name="tests_test_immutability.py_1.png"/>
                     <pic:cNvPicPr/>
                   </pic:nvPicPr>
                   <pic:blipFill>
@@ -803,7 +803,7 @@
                   <pic:spPr>
                     <a:xfrm>
                       <a:off x="0" y="0"/>
-                      <a:ext cx="5760000" cy="7108085"/>
+                      <a:ext cx="5760000" cy="8206364"/>
                     </a:xfrm>
                     <a:prstGeom prst="rect"/>
                   </pic:spPr>
@@ -826,7 +826,115 @@
           <w:i/>
           <w:sz w:val="24"/>
         </w:rPr>
-        <w:t>Рис. 5 – Benchmark до і після переходу на незмінні структури</w:t>
+        <w:t>Рис. 5 – Тести на немутацію та read-only поведінку (фрагмент 1)</w:t>
+      </w:r>
+    </w:p>
+    <w:p>
+      <w:pPr>
+        <w:jc w:val="center"/>
+      </w:pPr>
+      <w:r>
+        <w:drawing>
+          <wp:inline xmlns:a="http://schemas.openxmlformats.org/drawingml/2006/main" xmlns:pic="http://schemas.openxmlformats.org/drawingml/2006/picture">
+            <wp:extent cx="5760000" cy="6382222"/>
+            <wp:docPr id="6" name="Picture 6"/>
+            <wp:cNvGraphicFramePr>
+              <a:graphicFrameLocks noChangeAspect="1"/>
+            </wp:cNvGraphicFramePr>
+            <a:graphic>
+              <a:graphicData uri="http://schemas.openxmlformats.org/drawingml/2006/picture">
+                <pic:pic>
+                  <pic:nvPicPr>
+                    <pic:cNvPr id="0" name="tests_test_immutability.py_2.png"/>
+                    <pic:cNvPicPr/>
+                  </pic:nvPicPr>
+                  <pic:blipFill>
+                    <a:blip r:embed="rId14"/>
+                    <a:stretch>
+                      <a:fillRect/>
+                    </a:stretch>
+                  </pic:blipFill>
+                  <pic:spPr>
+                    <a:xfrm>
+                      <a:off x="0" y="0"/>
+                      <a:ext cx="5760000" cy="6382222"/>
+                    </a:xfrm>
+                    <a:prstGeom prst="rect"/>
+                  </pic:spPr>
+                </pic:pic>
+              </a:graphicData>
+            </a:graphic>
+          </wp:inline>
+        </w:drawing>
+      </w:r>
+    </w:p>
+    <w:p>
+      <w:pPr>
+        <w:keepNext w:val="0"/>
+        <w:spacing w:after="120"/>
+        <w:jc w:val="center"/>
+      </w:pPr>
+      <w:r>
+        <w:rPr>
+          <w:b w:val="0"/>
+          <w:i/>
+          <w:sz w:val="24"/>
+        </w:rPr>
+        <w:t>Рис. 6 – Тести на хешованість (фрагмент 2)</w:t>
+      </w:r>
+    </w:p>
+    <w:p>
+      <w:pPr>
+        <w:jc w:val="center"/>
+      </w:pPr>
+      <w:r>
+        <w:drawing>
+          <wp:inline xmlns:a="http://schemas.openxmlformats.org/drawingml/2006/main" xmlns:pic="http://schemas.openxmlformats.org/drawingml/2006/picture">
+            <wp:extent cx="5446849" cy="8460000"/>
+            <wp:docPr id="7" name="Picture 7"/>
+            <wp:cNvGraphicFramePr>
+              <a:graphicFrameLocks noChangeAspect="1"/>
+            </wp:cNvGraphicFramePr>
+            <a:graphic>
+              <a:graphicData uri="http://schemas.openxmlformats.org/drawingml/2006/picture">
+                <pic:pic>
+                  <pic:nvPicPr>
+                    <pic:cNvPr id="0" name="tests_test_performance.py.png"/>
+                    <pic:cNvPicPr/>
+                  </pic:nvPicPr>
+                  <pic:blipFill>
+                    <a:blip r:embed="rId15"/>
+                    <a:stretch>
+                      <a:fillRect/>
+                    </a:stretch>
+                  </pic:blipFill>
+                  <pic:spPr>
+                    <a:xfrm>
+                      <a:off x="0" y="0"/>
+                      <a:ext cx="5446849" cy="8460000"/>
+                    </a:xfrm>
+                    <a:prstGeom prst="rect"/>
+                  </pic:spPr>
+                </pic:pic>
+              </a:graphicData>
+            </a:graphic>
+          </wp:inline>
+        </w:drawing>
+      </w:r>
+    </w:p>
+    <w:p>
+      <w:pPr>
+        <w:keepNext w:val="0"/>
+        <w:spacing w:after="120"/>
+        <w:jc w:val="center"/>
+      </w:pPr>
+      <w:r>
+        <w:rPr>
+          <w:b w:val="0"/>
+          <w:i/>
+          <w:sz w:val="24"/>
+        </w:rPr>
+        <w:t>Рис. 7 – Benchmark до і після переходу на незмінні структури</w:t>
       </w:r>
     </w:p>
     <w:p>
@@ -837,7 +945,7 @@
         <w:drawing>
           <wp:inline xmlns:a="http://schemas.openxmlformats.org/drawingml/2006/main" xmlns:pic="http://schemas.openxmlformats.org/drawingml/2006/picture">
             <wp:extent cx="5760000" cy="6615446"/>
-            <wp:docPr id="6" name="Picture 6"/>
+            <wp:docPr id="8" name="Picture 8"/>
             <wp:cNvGraphicFramePr>
               <a:graphicFrameLocks noChangeAspect="1"/>
             </wp:cNvGraphicFramePr>
@@ -849,7 +957,7 @@
                     <pic:cNvPicPr/>
                   </pic:nvPicPr>
                   <pic:blipFill>
-                    <a:blip r:embed="rId14"/>
+                    <a:blip r:embed="rId16"/>
                     <a:stretch>
                       <a:fillRect/>
                     </a:stretch>
@@ -880,7 +988,7 @@
           <w:i/>
           <w:sz w:val="24"/>
         </w:rPr>
-        <w:t>Рис. 6 – Робота програми app.py</w:t>
+        <w:t>Рис. 8 – Робота програми app.py</w:t>
       </w:r>
     </w:p>
     <w:p>
@@ -890,8 +998,8 @@
       <w:r>
         <w:drawing>
           <wp:inline xmlns:a="http://schemas.openxmlformats.org/drawingml/2006/main" xmlns:pic="http://schemas.openxmlformats.org/drawingml/2006/picture">
-            <wp:extent cx="5760000" cy="4055040"/>
-            <wp:docPr id="7" name="Picture 7"/>
+            <wp:extent cx="5760000" cy="4424798"/>
+            <wp:docPr id="9" name="Picture 9"/>
             <wp:cNvGraphicFramePr>
               <a:graphicFrameLocks noChangeAspect="1"/>
             </wp:cNvGraphicFramePr>
@@ -903,7 +1011,7 @@
                     <pic:cNvPicPr/>
                   </pic:nvPicPr>
                   <pic:blipFill>
-                    <a:blip r:embed="rId15"/>
+                    <a:blip r:embed="rId17"/>
                     <a:stretch>
                       <a:fillRect/>
                     </a:stretch>
@@ -911,7 +1019,7 @@
                   <pic:spPr>
                     <a:xfrm>
                       <a:off x="0" y="0"/>
-                      <a:ext cx="5760000" cy="4055040"/>
+                      <a:ext cx="5760000" cy="4424798"/>
                     </a:xfrm>
                     <a:prstGeom prst="rect"/>
                   </pic:spPr>
@@ -934,7 +1042,7 @@
           <w:i/>
           <w:sz w:val="24"/>
         </w:rPr>
-        <w:t>Рис. 7 – Результати pytest</w:t>
+        <w:t>Рис. 9 – Результати pytest</w:t>
       </w:r>
     </w:p>
     <w:p>
@@ -945,7 +1053,7 @@
         <w:drawing>
           <wp:inline xmlns:a="http://schemas.openxmlformats.org/drawingml/2006/main" xmlns:pic="http://schemas.openxmlformats.org/drawingml/2006/picture">
             <wp:extent cx="5760000" cy="1650627"/>
-            <wp:docPr id="8" name="Picture 8"/>
+            <wp:docPr id="10" name="Picture 10"/>
             <wp:cNvGraphicFramePr>
               <a:graphicFrameLocks noChangeAspect="1"/>
             </wp:cNvGraphicFramePr>
@@ -957,7 +1065,7 @@
                     <pic:cNvPicPr/>
                   </pic:nvPicPr>
                   <pic:blipFill>
-                    <a:blip r:embed="rId16"/>
+                    <a:blip r:embed="rId18"/>
                     <a:stretch>
                       <a:fillRect/>
                     </a:stretch>
@@ -988,7 +1096,7 @@
           <w:i/>
           <w:sz w:val="24"/>
         </w:rPr>
-        <w:t>Рис. 8 – Час тестів pytest --durations=5</w:t>
+        <w:t>Рис. 10 – Час тестів pytest --durations=5</w:t>
       </w:r>
     </w:p>
     <w:p>
@@ -999,7 +1107,7 @@
         <w:drawing>
           <wp:inline xmlns:a="http://schemas.openxmlformats.org/drawingml/2006/main" xmlns:pic="http://schemas.openxmlformats.org/drawingml/2006/picture">
             <wp:extent cx="5760000" cy="1639708"/>
-            <wp:docPr id="9" name="Picture 9"/>
+            <wp:docPr id="11" name="Picture 11"/>
             <wp:cNvGraphicFramePr>
               <a:graphicFrameLocks noChangeAspect="1"/>
             </wp:cNvGraphicFramePr>
@@ -1011,7 +1119,7 @@
                     <pic:cNvPicPr/>
                   </pic:nvPicPr>
                   <pic:blipFill>
-                    <a:blip r:embed="rId17"/>
+                    <a:blip r:embed="rId19"/>
                     <a:stretch>
                       <a:fillRect/>
                     </a:stretch>
@@ -1042,7 +1150,7 @@
           <w:i/>
           <w:sz w:val="24"/>
         </w:rPr>
-        <w:t>Рис. 9 – Порівняння часу через pytest-benchmark</w:t>
+        <w:t>Рис. 11 – Порівняння часу через pytest-benchmark</w:t>
       </w:r>
     </w:p>
     <w:p>
@@ -1053,7 +1161,7 @@
         <w:drawing>
           <wp:inline xmlns:a="http://schemas.openxmlformats.org/drawingml/2006/main" xmlns:pic="http://schemas.openxmlformats.org/drawingml/2006/picture">
             <wp:extent cx="5760000" cy="906822"/>
-            <wp:docPr id="10" name="Picture 10"/>
+            <wp:docPr id="12" name="Picture 12"/>
             <wp:cNvGraphicFramePr>
               <a:graphicFrameLocks noChangeAspect="1"/>
             </wp:cNvGraphicFramePr>
@@ -1065,7 +1173,7 @@
                     <pic:cNvPicPr/>
                   </pic:nvPicPr>
                   <pic:blipFill>
-                    <a:blip r:embed="rId18"/>
+                    <a:blip r:embed="rId20"/>
                     <a:stretch>
                       <a:fillRect/>
                     </a:stretch>
@@ -1096,7 +1204,7 @@
           <w:i/>
           <w:sz w:val="24"/>
         </w:rPr>
-        <w:t>Рис. 10 – Перевірка mypy, black і ruff</w:t>
+        <w:t>Рис. 12 – Перевірка mypy, black і ruff</w:t>
       </w:r>
     </w:p>
     <w:p>

</xml_diff>

<commit_message>
Lab_03: plugin-free timing tests, fixtures instead of factories module
</commit_message>
<xml_diff>
--- a/Lab_03/report/Lab_03.docx
+++ b/Lab_03/report/Lab_03.docx
@@ -544,7 +544,7 @@
         <w:t xml:space="preserve">4. Тести та вимірювання. </w:t>
       </w:r>
       <w:r>
-        <w:t>24 pytest-тести перевіряють немутацію, read-only поведінку, FrozenInstanceError, коректність нових копій, хешованість і кеш. Час порівняно через --durations=5 та pytest-benchmark: стара мутабельна модель (mutable_model.py) проти нової.</w:t>
+        <w:t>24 pytest-тести перевіряють немутацію, read-only поведінку, FrozenInstanceError, коректність нових копій, хешованість і кеш. Час порівняно через --durations=5 та вимірювання perf_counter у tests/test_performance.py: стара мутабельна модель (mutable_model.py) проти нової.</w:t>
       </w:r>
     </w:p>
     <w:p>
@@ -782,7 +782,7 @@
       <w:r>
         <w:drawing>
           <wp:inline xmlns:a="http://schemas.openxmlformats.org/drawingml/2006/main" xmlns:pic="http://schemas.openxmlformats.org/drawingml/2006/picture">
-            <wp:extent cx="5760000" cy="8206364"/>
+            <wp:extent cx="5760000" cy="8451818"/>
             <wp:docPr id="5" name="Picture 5"/>
             <wp:cNvGraphicFramePr>
               <a:graphicFrameLocks noChangeAspect="1"/>
@@ -803,7 +803,7 @@
                   <pic:spPr>
                     <a:xfrm>
                       <a:off x="0" y="0"/>
-                      <a:ext cx="5760000" cy="8206364"/>
+                      <a:ext cx="5760000" cy="8451818"/>
                     </a:xfrm>
                     <a:prstGeom prst="rect"/>
                   </pic:spPr>
@@ -890,7 +890,7 @@
       <w:r>
         <w:drawing>
           <wp:inline xmlns:a="http://schemas.openxmlformats.org/drawingml/2006/main" xmlns:pic="http://schemas.openxmlformats.org/drawingml/2006/picture">
-            <wp:extent cx="5446849" cy="8460000"/>
+            <wp:extent cx="3660483" cy="8459999"/>
             <wp:docPr id="7" name="Picture 7"/>
             <wp:cNvGraphicFramePr>
               <a:graphicFrameLocks noChangeAspect="1"/>
@@ -911,7 +911,7 @@
                   <pic:spPr>
                     <a:xfrm>
                       <a:off x="0" y="0"/>
-                      <a:ext cx="5446849" cy="8460000"/>
+                      <a:ext cx="3660483" cy="8459999"/>
                     </a:xfrm>
                     <a:prstGeom prst="rect"/>
                   </pic:spPr>
@@ -934,7 +934,7 @@
           <w:i/>
           <w:sz w:val="24"/>
         </w:rPr>
-        <w:t>Рис. 7 – Benchmark до і після переходу на незмінні структури</w:t>
+        <w:t>Рис. 7 – Тести часу до і після переходу на незмінні структури</w:t>
       </w:r>
     </w:p>
     <w:p>
@@ -1052,7 +1052,7 @@
       <w:r>
         <w:drawing>
           <wp:inline xmlns:a="http://schemas.openxmlformats.org/drawingml/2006/main" xmlns:pic="http://schemas.openxmlformats.org/drawingml/2006/picture">
-            <wp:extent cx="5760000" cy="1650627"/>
+            <wp:extent cx="5760000" cy="1631150"/>
             <wp:docPr id="10" name="Picture 10"/>
             <wp:cNvGraphicFramePr>
               <a:graphicFrameLocks noChangeAspect="1"/>
@@ -1073,7 +1073,7 @@
                   <pic:spPr>
                     <a:xfrm>
                       <a:off x="0" y="0"/>
-                      <a:ext cx="5760000" cy="1650627"/>
+                      <a:ext cx="5760000" cy="1631150"/>
                     </a:xfrm>
                     <a:prstGeom prst="rect"/>
                   </pic:spPr>
@@ -1106,7 +1106,7 @@
       <w:r>
         <w:drawing>
           <wp:inline xmlns:a="http://schemas.openxmlformats.org/drawingml/2006/main" xmlns:pic="http://schemas.openxmlformats.org/drawingml/2006/picture">
-            <wp:extent cx="5760000" cy="1639708"/>
+            <wp:extent cx="5760000" cy="2044800"/>
             <wp:docPr id="11" name="Picture 11"/>
             <wp:cNvGraphicFramePr>
               <a:graphicFrameLocks noChangeAspect="1"/>
@@ -1127,7 +1127,7 @@
                   <pic:spPr>
                     <a:xfrm>
                       <a:off x="0" y="0"/>
-                      <a:ext cx="5760000" cy="1639708"/>
+                      <a:ext cx="5760000" cy="2044800"/>
                     </a:xfrm>
                     <a:prstGeom prst="rect"/>
                   </pic:spPr>
@@ -1150,7 +1150,7 @@
           <w:i/>
           <w:sz w:val="24"/>
         </w:rPr>
-        <w:t>Рис. 11 – Порівняння часу через pytest-benchmark</w:t>
+        <w:t>Рис. 11 – Порівняння часу до і після (perf_counter)</w:t>
       </w:r>
     </w:p>
     <w:p>

</xml_diff>

<commit_message>
Lab_03: Hypothesis property tests, Literal category, theory section in report
</commit_message>
<xml_diff>
--- a/Lab_03/report/Lab_03.docx
+++ b/Lab_03/report/Lab_03.docx
@@ -484,6 +484,45 @@
         <w:rPr>
           <w:b/>
         </w:rPr>
+        <w:t>Теоретичні відомості</w:t>
+      </w:r>
+    </w:p>
+    <w:p>
+      <w:pPr>
+        <w:ind w:firstLine="709"/>
+        <w:jc w:val="both"/>
+      </w:pPr>
+      <w:r>
+        <w:t>Функціональний стиль спирається на чисті функції та незмінні структури даних. Незмінність дає референтну прозорість, просту композицію, безпечне спільне читання і хешованість: незмінний об’єкт може бути ключем словника, елементом множини та аргументом lru_cache.</w:t>
+      </w:r>
+    </w:p>
+    <w:p>
+      <w:pPr>
+        <w:ind w:firstLine="709"/>
+        <w:jc w:val="both"/>
+      </w:pPr>
+      <w:r>
+        <w:t>У стандартній бібліотеці Python для цього є tuple замість list, frozenset замість set, @dataclass(frozen=True, slots=True) для доменних сутностей (поля не можна присвоїти, усі оновлення виконуються через dataclasses.replace, який повертає нову копію) і MappingProxyType — представлення словника лише для читання.</w:t>
+      </w:r>
+    </w:p>
+    <w:p>
+      <w:pPr>
+        <w:ind w:firstLine="709"/>
+        <w:jc w:val="both"/>
+      </w:pPr>
+      <w:r>
+        <w:t>MappingProxyType захищає лише верхній рівень і показує зміни вихідного словника, тому перед обгортанням джерело копіюють; для вкладених структур потрібне глибоке заморожування. Ціна незмінності — створення нового об’єкта на кожне оновлення, але це компенсується відсутністю захисних копій і можливістю кешувати чисті розрахунки.</w:t>
+      </w:r>
+    </w:p>
+    <w:p>
+      <w:pPr>
+        <w:keepNext/>
+        <w:spacing w:after="80"/>
+      </w:pPr>
+      <w:r>
+        <w:rPr>
+          <w:b/>
+        </w:rPr>
         <w:t>Хід роботи</w:t>
       </w:r>
     </w:p>
@@ -544,7 +583,7 @@
         <w:t xml:space="preserve">4. Тести та вимірювання. </w:t>
       </w:r>
       <w:r>
-        <w:t>24 pytest-тести перевіряють немутацію, read-only поведінку, FrozenInstanceError, коректність нових копій, хешованість і кеш. Час порівняно через --durations=5 та вимірювання perf_counter у tests/test_performance.py: стара мутабельна модель (mutable_model.py) проти нової.</w:t>
+        <w:t>29 pytest-тестів (з них 5 property-based на Hypothesis) перевіряють немутацію, read-only поведінку, FrozenInstanceError, коректність нових копій, хешованість і кеш. Час порівняно через --durations=5 та вимірювання perf_counter у tests/test_performance.py: стара мутабельна модель (mutable_model.py) проти нової.</w:t>
       </w:r>
     </w:p>
     <w:p>
@@ -566,7 +605,7 @@
       <w:r>
         <w:drawing>
           <wp:inline xmlns:a="http://schemas.openxmlformats.org/drawingml/2006/main" xmlns:pic="http://schemas.openxmlformats.org/drawingml/2006/picture">
-            <wp:extent cx="5760000" cy="6255484"/>
+            <wp:extent cx="5760000" cy="6487742"/>
             <wp:docPr id="1" name="Picture 1"/>
             <wp:cNvGraphicFramePr>
               <a:graphicFrameLocks noChangeAspect="1"/>
@@ -587,7 +626,7 @@
                   <pic:spPr>
                     <a:xfrm>
                       <a:off x="0" y="0"/>
-                      <a:ext cx="5760000" cy="6255484"/>
+                      <a:ext cx="5760000" cy="6487742"/>
                     </a:xfrm>
                     <a:prstGeom prst="rect"/>
                   </pic:spPr>
@@ -890,8 +929,62 @@
       <w:r>
         <w:drawing>
           <wp:inline xmlns:a="http://schemas.openxmlformats.org/drawingml/2006/main" xmlns:pic="http://schemas.openxmlformats.org/drawingml/2006/picture">
+            <wp:extent cx="5497472" cy="8459999"/>
+            <wp:docPr id="7" name="Picture 7"/>
+            <wp:cNvGraphicFramePr>
+              <a:graphicFrameLocks noChangeAspect="1"/>
+            </wp:cNvGraphicFramePr>
+            <a:graphic>
+              <a:graphicData uri="http://schemas.openxmlformats.org/drawingml/2006/picture">
+                <pic:pic>
+                  <pic:nvPicPr>
+                    <pic:cNvPr id="0" name="tests_test_properties.py_p.png"/>
+                    <pic:cNvPicPr/>
+                  </pic:nvPicPr>
+                  <pic:blipFill>
+                    <a:blip r:embed="rId15"/>
+                    <a:stretch>
+                      <a:fillRect/>
+                    </a:stretch>
+                  </pic:blipFill>
+                  <pic:spPr>
+                    <a:xfrm>
+                      <a:off x="0" y="0"/>
+                      <a:ext cx="5497472" cy="8459999"/>
+                    </a:xfrm>
+                    <a:prstGeom prst="rect"/>
+                  </pic:spPr>
+                </pic:pic>
+              </a:graphicData>
+            </a:graphic>
+          </wp:inline>
+        </w:drawing>
+      </w:r>
+    </w:p>
+    <w:p>
+      <w:pPr>
+        <w:keepNext w:val="0"/>
+        <w:spacing w:after="120"/>
+        <w:jc w:val="center"/>
+      </w:pPr>
+      <w:r>
+        <w:rPr>
+          <w:b w:val="0"/>
+          <w:i/>
+          <w:sz w:val="24"/>
+        </w:rPr>
+        <w:t>Рис. 7 – Property-тести Hypothesis: чистота оновлень і hash, узгоджений з ==</w:t>
+      </w:r>
+    </w:p>
+    <w:p>
+      <w:pPr>
+        <w:jc w:val="center"/>
+      </w:pPr>
+      <w:r>
+        <w:drawing>
+          <wp:inline xmlns:a="http://schemas.openxmlformats.org/drawingml/2006/main" xmlns:pic="http://schemas.openxmlformats.org/drawingml/2006/picture">
             <wp:extent cx="3660483" cy="8459999"/>
-            <wp:docPr id="7" name="Picture 7"/>
+            <wp:docPr id="8" name="Picture 8"/>
             <wp:cNvGraphicFramePr>
               <a:graphicFrameLocks noChangeAspect="1"/>
             </wp:cNvGraphicFramePr>
@@ -903,7 +996,7 @@
                     <pic:cNvPicPr/>
                   </pic:nvPicPr>
                   <pic:blipFill>
-                    <a:blip r:embed="rId15"/>
+                    <a:blip r:embed="rId16"/>
                     <a:stretch>
                       <a:fillRect/>
                     </a:stretch>
@@ -934,7 +1027,7 @@
           <w:i/>
           <w:sz w:val="24"/>
         </w:rPr>
-        <w:t>Рис. 7 – Тести часу до і після переходу на незмінні структури</w:t>
+        <w:t>Рис. 8 – Тести часу до і після переходу на незмінні структури</w:t>
       </w:r>
     </w:p>
     <w:p>
@@ -945,7 +1038,7 @@
         <w:drawing>
           <wp:inline xmlns:a="http://schemas.openxmlformats.org/drawingml/2006/main" xmlns:pic="http://schemas.openxmlformats.org/drawingml/2006/picture">
             <wp:extent cx="5760000" cy="6615446"/>
-            <wp:docPr id="8" name="Picture 8"/>
+            <wp:docPr id="9" name="Picture 9"/>
             <wp:cNvGraphicFramePr>
               <a:graphicFrameLocks noChangeAspect="1"/>
             </wp:cNvGraphicFramePr>
@@ -957,7 +1050,7 @@
                     <pic:cNvPicPr/>
                   </pic:nvPicPr>
                   <pic:blipFill>
-                    <a:blip r:embed="rId16"/>
+                    <a:blip r:embed="rId17"/>
                     <a:stretch>
                       <a:fillRect/>
                     </a:stretch>
@@ -988,7 +1081,7 @@
           <w:i/>
           <w:sz w:val="24"/>
         </w:rPr>
-        <w:t>Рис. 8 – Робота програми app.py</w:t>
+        <w:t>Рис. 9 – Робота програми app.py</w:t>
       </w:r>
     </w:p>
     <w:p>
@@ -998,8 +1091,8 @@
       <w:r>
         <w:drawing>
           <wp:inline xmlns:a="http://schemas.openxmlformats.org/drawingml/2006/main" xmlns:pic="http://schemas.openxmlformats.org/drawingml/2006/picture">
-            <wp:extent cx="5760000" cy="4424798"/>
-            <wp:docPr id="9" name="Picture 9"/>
+            <wp:extent cx="5760000" cy="5239892"/>
+            <wp:docPr id="10" name="Picture 10"/>
             <wp:cNvGraphicFramePr>
               <a:graphicFrameLocks noChangeAspect="1"/>
             </wp:cNvGraphicFramePr>
@@ -1011,7 +1104,7 @@
                     <pic:cNvPicPr/>
                   </pic:nvPicPr>
                   <pic:blipFill>
-                    <a:blip r:embed="rId17"/>
+                    <a:blip r:embed="rId18"/>
                     <a:stretch>
                       <a:fillRect/>
                     </a:stretch>
@@ -1019,7 +1112,7 @@
                   <pic:spPr>
                     <a:xfrm>
                       <a:off x="0" y="0"/>
-                      <a:ext cx="5760000" cy="4424798"/>
+                      <a:ext cx="5760000" cy="5239892"/>
                     </a:xfrm>
                     <a:prstGeom prst="rect"/>
                   </pic:spPr>
@@ -1042,7 +1135,7 @@
           <w:i/>
           <w:sz w:val="24"/>
         </w:rPr>
-        <w:t>Рис. 9 – Результати pytest</w:t>
+        <w:t>Рис. 10 – Результати pytest</w:t>
       </w:r>
     </w:p>
     <w:p>
@@ -1052,8 +1145,8 @@
       <w:r>
         <w:drawing>
           <wp:inline xmlns:a="http://schemas.openxmlformats.org/drawingml/2006/main" xmlns:pic="http://schemas.openxmlformats.org/drawingml/2006/picture">
-            <wp:extent cx="5760000" cy="1631150"/>
-            <wp:docPr id="10" name="Picture 10"/>
+            <wp:extent cx="5760000" cy="1490458"/>
+            <wp:docPr id="11" name="Picture 11"/>
             <wp:cNvGraphicFramePr>
               <a:graphicFrameLocks noChangeAspect="1"/>
             </wp:cNvGraphicFramePr>
@@ -1065,7 +1158,7 @@
                     <pic:cNvPicPr/>
                   </pic:nvPicPr>
                   <pic:blipFill>
-                    <a:blip r:embed="rId18"/>
+                    <a:blip r:embed="rId19"/>
                     <a:stretch>
                       <a:fillRect/>
                     </a:stretch>
@@ -1073,7 +1166,7 @@
                   <pic:spPr>
                     <a:xfrm>
                       <a:off x="0" y="0"/>
-                      <a:ext cx="5760000" cy="1631150"/>
+                      <a:ext cx="5760000" cy="1490458"/>
                     </a:xfrm>
                     <a:prstGeom prst="rect"/>
                   </pic:spPr>
@@ -1096,7 +1189,7 @@
           <w:i/>
           <w:sz w:val="24"/>
         </w:rPr>
-        <w:t>Рис. 10 – Час тестів pytest --durations=5</w:t>
+        <w:t>Рис. 11 – Час тестів pytest --durations=5</w:t>
       </w:r>
     </w:p>
     <w:p>
@@ -1107,7 +1200,7 @@
         <w:drawing>
           <wp:inline xmlns:a="http://schemas.openxmlformats.org/drawingml/2006/main" xmlns:pic="http://schemas.openxmlformats.org/drawingml/2006/picture">
             <wp:extent cx="5760000" cy="2044800"/>
-            <wp:docPr id="11" name="Picture 11"/>
+            <wp:docPr id="12" name="Picture 12"/>
             <wp:cNvGraphicFramePr>
               <a:graphicFrameLocks noChangeAspect="1"/>
             </wp:cNvGraphicFramePr>
@@ -1119,7 +1212,7 @@
                     <pic:cNvPicPr/>
                   </pic:nvPicPr>
                   <pic:blipFill>
-                    <a:blip r:embed="rId19"/>
+                    <a:blip r:embed="rId20"/>
                     <a:stretch>
                       <a:fillRect/>
                     </a:stretch>
@@ -1150,7 +1243,7 @@
           <w:i/>
           <w:sz w:val="24"/>
         </w:rPr>
-        <w:t>Рис. 11 – Порівняння часу до і після (perf_counter)</w:t>
+        <w:t>Рис. 12 – Порівняння часу до і після (perf_counter)</w:t>
       </w:r>
     </w:p>
     <w:p>
@@ -1161,7 +1254,7 @@
         <w:drawing>
           <wp:inline xmlns:a="http://schemas.openxmlformats.org/drawingml/2006/main" xmlns:pic="http://schemas.openxmlformats.org/drawingml/2006/picture">
             <wp:extent cx="5760000" cy="906822"/>
-            <wp:docPr id="12" name="Picture 12"/>
+            <wp:docPr id="13" name="Picture 13"/>
             <wp:cNvGraphicFramePr>
               <a:graphicFrameLocks noChangeAspect="1"/>
             </wp:cNvGraphicFramePr>
@@ -1173,7 +1266,7 @@
                     <pic:cNvPicPr/>
                   </pic:nvPicPr>
                   <pic:blipFill>
-                    <a:blip r:embed="rId20"/>
+                    <a:blip r:embed="rId21"/>
                     <a:stretch>
                       <a:fillRect/>
                     </a:stretch>
@@ -1204,7 +1297,7 @@
           <w:i/>
           <w:sz w:val="24"/>
         </w:rPr>
-        <w:t>Рис. 12 – Перевірка mypy, black і ruff</w:t>
+        <w:t>Рис. 13 – Перевірка mypy, black і ruff</w:t>
       </w:r>
     </w:p>
     <w:p>

</xml_diff>

<commit_message>
Lab_03: restructure after reference layout (main.py, root conftest, property tests, cached value)
</commit_message>
<xml_diff>
--- a/Lab_03/report/Lab_03.docx
+++ b/Lab_03/report/Lab_03.docx
@@ -535,67 +535,10 @@
         <w:rPr>
           <w:b/>
         </w:rPr>
-        <w:t xml:space="preserve">1. Незмінна модель (model.py). </w:t>
+        <w:t xml:space="preserve">1. </w:t>
       </w:r>
       <w:r>
-        <w:t>Рух товару описано як NamedTuple Movement, товар і складський запис — як @dataclass(frozen=True, slots=True). Історія рухів зберігається у tuple, теги — у frozenset, метадані постачальника — у MappingProxyType, який будується з копії словника (make_meta). Для вкладених структур реалізовано freeze(obj).</w:t>
-      </w:r>
-    </w:p>
-    <w:p>
-      <w:pPr>
-        <w:ind w:firstLine="709"/>
-        <w:jc w:val="both"/>
-      </w:pPr>
-      <w:r>
-        <w:rPr>
-          <w:b/>
-        </w:rPr>
-        <w:t xml:space="preserve">2. Pure-оновлення (core.py). </w:t>
-      </w:r>
-      <w:r>
-        <w:t>Функції restock, ship, change_price, add_tag, remove_tag, update_supplier повертають нові об’єкти через dataclasses.replace, конкатенацію tuple та операції frozenset; базові методи with_price, with_tag, with_movement визначені прямо в frozen-класах. Правило знижок make_category_discount + apply_price_rule повертає новий кортеж записів, reorder_cost кешується через lru_cache.</w:t>
-      </w:r>
-    </w:p>
-    <w:p>
-      <w:pPr>
-        <w:ind w:firstLine="709"/>
-        <w:jc w:val="both"/>
-      </w:pPr>
-      <w:r>
-        <w:rPr>
-          <w:b/>
-        </w:rPr>
-        <w:t xml:space="preserve">3. Хешованість. </w:t>
-      </w:r>
-      <w:r>
-        <w:t>StockRecord хешований: поле supplier (MappingProxyType) не хешується, тому воно виключене з хешу через field(hash=False), але бере участь у порівнянні. Запис використовується як ключ dict і lru_cache.</w:t>
-      </w:r>
-    </w:p>
-    <w:p>
-      <w:pPr>
-        <w:ind w:firstLine="709"/>
-        <w:jc w:val="both"/>
-      </w:pPr>
-      <w:r>
-        <w:rPr>
-          <w:b/>
-        </w:rPr>
-        <w:t xml:space="preserve">4. Тести та вимірювання. </w:t>
-      </w:r>
-      <w:r>
-        <w:t>29 pytest-тестів (з них 5 property-based на Hypothesis) перевіряють немутацію, read-only поведінку, FrozenInstanceError, коректність нових копій, хешованість і кеш. Час порівняно через --durations=5 та вимірювання perf_counter у tests/test_performance.py: стара мутабельна модель (mutable_model.py) проти нової.</w:t>
-      </w:r>
-    </w:p>
-    <w:p>
-      <w:pPr>
-        <w:keepNext/>
-        <w:spacing w:after="80"/>
-      </w:pPr>
-      <w:r>
-        <w:rPr>
-          <w:b/>
-        </w:rPr>
-        <w:t>Результат роботи</w:t>
+        <w:t>Спочатку зафіксував мутабельну модель «до» у mutable_model.py: запис складу як dict зі списком партій, множиною тегів і вкладеним словником товару; усі оновлення in-place, вартість щоразу перераховується. Файл лишено для порівняння часу.</w:t>
       </w:r>
     </w:p>
     <w:p>
@@ -605,7 +548,7 @@
       <w:r>
         <w:drawing>
           <wp:inline xmlns:a="http://schemas.openxmlformats.org/drawingml/2006/main" xmlns:pic="http://schemas.openxmlformats.org/drawingml/2006/picture">
-            <wp:extent cx="5760000" cy="6487742"/>
+            <wp:extent cx="5760000" cy="6344000"/>
             <wp:docPr id="1" name="Picture 1"/>
             <wp:cNvGraphicFramePr>
               <a:graphicFrameLocks noChangeAspect="1"/>
@@ -614,7 +557,7 @@
               <a:graphicData uri="http://schemas.openxmlformats.org/drawingml/2006/picture">
                 <pic:pic>
                   <pic:nvPicPr>
-                    <pic:cNvPr id="0" name="model.py_1.png"/>
+                    <pic:cNvPr id="0" name="mutable_model.py.png"/>
                     <pic:cNvPicPr/>
                   </pic:nvPicPr>
                   <pic:blipFill>
@@ -626,7 +569,7 @@
                   <pic:spPr>
                     <a:xfrm>
                       <a:off x="0" y="0"/>
-                      <a:ext cx="5760000" cy="6487742"/>
+                      <a:ext cx="5760000" cy="6344000"/>
                     </a:xfrm>
                     <a:prstGeom prst="rect"/>
                   </pic:spPr>
@@ -649,7 +592,22 @@
           <w:i/>
           <w:sz w:val="24"/>
         </w:rPr>
-        <w:t>Рис. 1 – Незмінна модель model.py (частина 1)</w:t>
+        <w:t>Рис. 1 – Мутабельна модель «до» mutable_model.py</w:t>
+      </w:r>
+    </w:p>
+    <w:p>
+      <w:pPr>
+        <w:ind w:firstLine="709"/>
+        <w:jc w:val="both"/>
+      </w:pPr>
+      <w:r>
+        <w:rPr>
+          <w:b/>
+        </w:rPr>
+        <w:t xml:space="preserve">2. </w:t>
+      </w:r>
+      <w:r>
+        <w:t>У model.py описав незмінну модель: тип тегу через Literal, сутності Product і StockRecord як @dataclass(frozen=True, slots=True). Партії поповнення зберігаються у tuple, теги у frozenset, метадані постачальника — як read-only Mapping.</w:t>
       </w:r>
     </w:p>
     <w:p>
@@ -659,7 +617,7 @@
       <w:r>
         <w:drawing>
           <wp:inline xmlns:a="http://schemas.openxmlformats.org/drawingml/2006/main" xmlns:pic="http://schemas.openxmlformats.org/drawingml/2006/picture">
-            <wp:extent cx="5760000" cy="5782737"/>
+            <wp:extent cx="5760000" cy="3502921"/>
             <wp:docPr id="2" name="Picture 2"/>
             <wp:cNvGraphicFramePr>
               <a:graphicFrameLocks noChangeAspect="1"/>
@@ -668,7 +626,7 @@
               <a:graphicData uri="http://schemas.openxmlformats.org/drawingml/2006/picture">
                 <pic:pic>
                   <pic:nvPicPr>
-                    <pic:cNvPr id="0" name="model.py_2.png"/>
+                    <pic:cNvPr id="0" name="model.py_1.png"/>
                     <pic:cNvPicPr/>
                   </pic:nvPicPr>
                   <pic:blipFill>
@@ -680,7 +638,7 @@
                   <pic:spPr>
                     <a:xfrm>
                       <a:off x="0" y="0"/>
-                      <a:ext cx="5760000" cy="5782737"/>
+                      <a:ext cx="5760000" cy="3502921"/>
                     </a:xfrm>
                     <a:prstGeom prst="rect"/>
                   </pic:spPr>
@@ -703,7 +661,22 @@
           <w:i/>
           <w:sz w:val="24"/>
         </w:rPr>
-        <w:t>Рис. 2 – Методи pure-оновлення StockRecord у model.py (частина 2)</w:t>
+        <w:t>Рис. 2 – Тип Tag і сутність Product у model.py</w:t>
+      </w:r>
+    </w:p>
+    <w:p>
+      <w:pPr>
+        <w:ind w:firstLine="709"/>
+        <w:jc w:val="both"/>
+      </w:pPr>
+      <w:r>
+        <w:rPr>
+          <w:b/>
+        </w:rPr>
+        <w:t xml:space="preserve">3. </w:t>
+      </w:r>
+      <w:r>
+        <w:t>Методи restock, change_price, add_tag, deactivate повертають нові копії через replace, конкатенацію tuple та об’єднання frozenset; make_meta обгортає у MappingProxyType копію словника, make_record — зручний конструктор.</w:t>
       </w:r>
     </w:p>
     <w:p>
@@ -713,7 +686,7 @@
       <w:r>
         <w:drawing>
           <wp:inline xmlns:a="http://schemas.openxmlformats.org/drawingml/2006/main" xmlns:pic="http://schemas.openxmlformats.org/drawingml/2006/picture">
-            <wp:extent cx="5760000" cy="6274286"/>
+            <wp:extent cx="5760000" cy="5441684"/>
             <wp:docPr id="3" name="Picture 3"/>
             <wp:cNvGraphicFramePr>
               <a:graphicFrameLocks noChangeAspect="1"/>
@@ -722,7 +695,7 @@
               <a:graphicData uri="http://schemas.openxmlformats.org/drawingml/2006/picture">
                 <pic:pic>
                   <pic:nvPicPr>
-                    <pic:cNvPr id="0" name="core.py_1.png"/>
+                    <pic:cNvPr id="0" name="model.py_2.png"/>
                     <pic:cNvPicPr/>
                   </pic:nvPicPr>
                   <pic:blipFill>
@@ -734,7 +707,7 @@
                   <pic:spPr>
                     <a:xfrm>
                       <a:off x="0" y="0"/>
-                      <a:ext cx="5760000" cy="6274286"/>
+                      <a:ext cx="5760000" cy="5441684"/>
                     </a:xfrm>
                     <a:prstGeom prst="rect"/>
                   </pic:spPr>
@@ -757,7 +730,22 @@
           <w:i/>
           <w:sz w:val="24"/>
         </w:rPr>
-        <w:t>Рис. 3 – Pure-оновлення core.py (частина 1)</w:t>
+        <w:t>Рис. 3 – StockRecord, make_meta і make_record у model.py</w:t>
+      </w:r>
+    </w:p>
+    <w:p>
+      <w:pPr>
+        <w:ind w:firstLine="709"/>
+        <w:jc w:val="both"/>
+      </w:pPr>
+      <w:r>
+        <w:rPr>
+          <w:b/>
+        </w:rPr>
+        <w:t xml:space="preserve">4. </w:t>
+      </w:r>
+      <w:r>
+        <w:t>У core.py реалізував чисті бізнес-функції: таблицю знижок за тегами як read-only mapping, discount_factor, кешований через @lru_cache розрахунок stock_value (можливий лише тому, що StockRecord хешований) та pure-оновлення restock, change_price, add_tag.</w:t>
       </w:r>
     </w:p>
     <w:p>
@@ -767,7 +755,7 @@
       <w:r>
         <w:drawing>
           <wp:inline xmlns:a="http://schemas.openxmlformats.org/drawingml/2006/main" xmlns:pic="http://schemas.openxmlformats.org/drawingml/2006/picture">
-            <wp:extent cx="5760000" cy="5100632"/>
+            <wp:extent cx="5760000" cy="5864000"/>
             <wp:docPr id="4" name="Picture 4"/>
             <wp:cNvGraphicFramePr>
               <a:graphicFrameLocks noChangeAspect="1"/>
@@ -776,7 +764,7 @@
               <a:graphicData uri="http://schemas.openxmlformats.org/drawingml/2006/picture">
                 <pic:pic>
                   <pic:nvPicPr>
-                    <pic:cNvPr id="0" name="core.py_2.png"/>
+                    <pic:cNvPr id="0" name="core.py_1.png"/>
                     <pic:cNvPicPr/>
                   </pic:nvPicPr>
                   <pic:blipFill>
@@ -788,7 +776,7 @@
                   <pic:spPr>
                     <a:xfrm>
                       <a:off x="0" y="0"/>
-                      <a:ext cx="5760000" cy="5100632"/>
+                      <a:ext cx="5760000" cy="5864000"/>
                     </a:xfrm>
                     <a:prstGeom prst="rect"/>
                   </pic:spPr>
@@ -811,7 +799,22 @@
           <w:i/>
           <w:sz w:val="24"/>
         </w:rPr>
-        <w:t>Рис. 4 – Бізнес-функції, правило знижок і lru_cache у core.py (частина 2)</w:t>
+        <w:t>Рис. 4 – Знижки, кешована вартість і pure-оновлення у core.py</w:t>
+      </w:r>
+    </w:p>
+    <w:p>
+      <w:pPr>
+        <w:ind w:firstLine="709"/>
+        <w:jc w:val="both"/>
+      </w:pPr>
+      <w:r>
+        <w:rPr>
+          <w:b/>
+        </w:rPr>
+        <w:t xml:space="preserve">5. </w:t>
+      </w:r>
+      <w:r>
+        <w:t>Додав with_supplier, recalculate, index_by_record, де запис використовується як ключ словника, та утиліту freeze для глибокого заморожування. Поле supplier (mappingproxy) не має __hash__, тому в моделі воно виключене з хешу через field(hash=False), але бере участь у порівнянні.</w:t>
       </w:r>
     </w:p>
     <w:p>
@@ -821,7 +824,7 @@
       <w:r>
         <w:drawing>
           <wp:inline xmlns:a="http://schemas.openxmlformats.org/drawingml/2006/main" xmlns:pic="http://schemas.openxmlformats.org/drawingml/2006/picture">
-            <wp:extent cx="5760000" cy="8451818"/>
+            <wp:extent cx="5760000" cy="3850105"/>
             <wp:docPr id="5" name="Picture 5"/>
             <wp:cNvGraphicFramePr>
               <a:graphicFrameLocks noChangeAspect="1"/>
@@ -830,7 +833,7 @@
               <a:graphicData uri="http://schemas.openxmlformats.org/drawingml/2006/picture">
                 <pic:pic>
                   <pic:nvPicPr>
-                    <pic:cNvPr id="0" name="tests_test_immutability.py_1.png"/>
+                    <pic:cNvPr id="0" name="core.py_2.png"/>
                     <pic:cNvPicPr/>
                   </pic:nvPicPr>
                   <pic:blipFill>
@@ -842,7 +845,7 @@
                   <pic:spPr>
                     <a:xfrm>
                       <a:off x="0" y="0"/>
-                      <a:ext cx="5760000" cy="8451818"/>
+                      <a:ext cx="5760000" cy="3850105"/>
                     </a:xfrm>
                     <a:prstGeom prst="rect"/>
                   </pic:spPr>
@@ -865,7 +868,22 @@
           <w:i/>
           <w:sz w:val="24"/>
         </w:rPr>
-        <w:t>Рис. 5 – Тести на немутацію та read-only поведінку (фрагмент 1)</w:t>
+        <w:t>Рис. 5 – with_supplier, index_by_record і freeze у core.py</w:t>
+      </w:r>
+    </w:p>
+    <w:p>
+      <w:pPr>
+        <w:ind w:firstLine="709"/>
+        <w:jc w:val="both"/>
+      </w:pPr>
+      <w:r>
+        <w:rPr>
+          <w:b/>
+        </w:rPr>
+        <w:t xml:space="preserve">6. </w:t>
+      </w:r>
+      <w:r>
+        <w:t>Демонстраційний скрипт main.py будує ланцюжок із трьох pure-оновлень, показує, що початковий запис не змінився, друкує стан кешу та перевіряє read-only поведінку метаданих.</w:t>
       </w:r>
     </w:p>
     <w:p>
@@ -875,7 +893,7 @@
       <w:r>
         <w:drawing>
           <wp:inline xmlns:a="http://schemas.openxmlformats.org/drawingml/2006/main" xmlns:pic="http://schemas.openxmlformats.org/drawingml/2006/picture">
-            <wp:extent cx="5760000" cy="6382222"/>
+            <wp:extent cx="5760000" cy="6010105"/>
             <wp:docPr id="6" name="Picture 6"/>
             <wp:cNvGraphicFramePr>
               <a:graphicFrameLocks noChangeAspect="1"/>
@@ -884,7 +902,7 @@
               <a:graphicData uri="http://schemas.openxmlformats.org/drawingml/2006/picture">
                 <pic:pic>
                   <pic:nvPicPr>
-                    <pic:cNvPr id="0" name="tests_test_immutability.py_2.png"/>
+                    <pic:cNvPr id="0" name="main.py.png"/>
                     <pic:cNvPicPr/>
                   </pic:nvPicPr>
                   <pic:blipFill>
@@ -896,7 +914,7 @@
                   <pic:spPr>
                     <a:xfrm>
                       <a:off x="0" y="0"/>
-                      <a:ext cx="5760000" cy="6382222"/>
+                      <a:ext cx="5760000" cy="6010105"/>
                     </a:xfrm>
                     <a:prstGeom prst="rect"/>
                   </pic:spPr>
@@ -919,7 +937,22 @@
           <w:i/>
           <w:sz w:val="24"/>
         </w:rPr>
-        <w:t>Рис. 6 – Тести на хешованість (фрагмент 2)</w:t>
+        <w:t>Рис. 6 – Демонстраційний скрипт main.py</w:t>
+      </w:r>
+    </w:p>
+    <w:p>
+      <w:pPr>
+        <w:ind w:firstLine="709"/>
+        <w:jc w:val="both"/>
+      </w:pPr>
+      <w:r>
+        <w:rPr>
+          <w:b/>
+        </w:rPr>
+        <w:t xml:space="preserve">7. </w:t>
+      </w:r>
+      <w:r>
+        <w:t>Тести у tests/test_immutability.py перевіряють відсутність мутації після поповнення, зміни ціни й додавання тегу, FrozenInstanceError при присвоєнні поля, TypeError при записі у proxy, копіювання джерела make_meta і нову мапу у with_supplier.</w:t>
       </w:r>
     </w:p>
     <w:p>
@@ -929,7 +962,7 @@
       <w:r>
         <w:drawing>
           <wp:inline xmlns:a="http://schemas.openxmlformats.org/drawingml/2006/main" xmlns:pic="http://schemas.openxmlformats.org/drawingml/2006/picture">
-            <wp:extent cx="5497472" cy="8459999"/>
+            <wp:extent cx="5377785" cy="8460000"/>
             <wp:docPr id="7" name="Picture 7"/>
             <wp:cNvGraphicFramePr>
               <a:graphicFrameLocks noChangeAspect="1"/>
@@ -938,7 +971,7 @@
               <a:graphicData uri="http://schemas.openxmlformats.org/drawingml/2006/picture">
                 <pic:pic>
                   <pic:nvPicPr>
-                    <pic:cNvPr id="0" name="tests_test_properties.py_p.png"/>
+                    <pic:cNvPr id="0" name="tests_test_immutability.py_1.png"/>
                     <pic:cNvPicPr/>
                   </pic:nvPicPr>
                   <pic:blipFill>
@@ -950,7 +983,7 @@
                   <pic:spPr>
                     <a:xfrm>
                       <a:off x="0" y="0"/>
-                      <a:ext cx="5497472" cy="8459999"/>
+                      <a:ext cx="5377785" cy="8460000"/>
                     </a:xfrm>
                     <a:prstGeom prst="rect"/>
                   </pic:spPr>
@@ -973,7 +1006,22 @@
           <w:i/>
           <w:sz w:val="24"/>
         </w:rPr>
-        <w:t>Рис. 7 – Property-тести Hypothesis: чистота оновлень і hash, узгоджений з ==</w:t>
+        <w:t>Рис. 7 – Тести на немутацію, read-only і хешованість</w:t>
+      </w:r>
+    </w:p>
+    <w:p>
+      <w:pPr>
+        <w:ind w:firstLine="709"/>
+        <w:jc w:val="both"/>
+      </w:pPr>
+      <w:r>
+        <w:rPr>
+          <w:b/>
+        </w:rPr>
+        <w:t xml:space="preserve">8. </w:t>
+      </w:r>
+      <w:r>
+        <w:t>Тести на кеш stock_value через cache_info, глибоке заморожування та два property-тести на Hypothesis: restock чистий, а рівні записи мають однаковий хеш і однакову кешовану вартість.</w:t>
       </w:r>
     </w:p>
     <w:p>
@@ -983,7 +1031,7 @@
       <w:r>
         <w:drawing>
           <wp:inline xmlns:a="http://schemas.openxmlformats.org/drawingml/2006/main" xmlns:pic="http://schemas.openxmlformats.org/drawingml/2006/picture">
-            <wp:extent cx="3660483" cy="8459999"/>
+            <wp:extent cx="5760000" cy="5790968"/>
             <wp:docPr id="8" name="Picture 8"/>
             <wp:cNvGraphicFramePr>
               <a:graphicFrameLocks noChangeAspect="1"/>
@@ -992,7 +1040,7 @@
               <a:graphicData uri="http://schemas.openxmlformats.org/drawingml/2006/picture">
                 <pic:pic>
                   <pic:nvPicPr>
-                    <pic:cNvPr id="0" name="tests_test_performance.py.png"/>
+                    <pic:cNvPr id="0" name="tests_test_immutability.py_2.png"/>
                     <pic:cNvPicPr/>
                   </pic:nvPicPr>
                   <pic:blipFill>
@@ -1004,7 +1052,7 @@
                   <pic:spPr>
                     <a:xfrm>
                       <a:off x="0" y="0"/>
-                      <a:ext cx="3660483" cy="8459999"/>
+                      <a:ext cx="5760000" cy="5790968"/>
                     </a:xfrm>
                     <a:prstGeom prst="rect"/>
                   </pic:spPr>
@@ -1027,7 +1075,22 @@
           <w:i/>
           <w:sz w:val="24"/>
         </w:rPr>
-        <w:t>Рис. 8 – Тести часу до і після переходу на незмінні структури</w:t>
+        <w:t>Рис. 8 – Тести кешу, freeze і property-тести Hypothesis</w:t>
+      </w:r>
+    </w:p>
+    <w:p>
+      <w:pPr>
+        <w:ind w:firstLine="709"/>
+        <w:jc w:val="both"/>
+      </w:pPr>
+      <w:r>
+        <w:rPr>
+          <w:b/>
+        </w:rPr>
+        <w:t xml:space="preserve">9. </w:t>
+      </w:r>
+      <w:r>
+        <w:t>Для вимірювання ефекту у tests/test_performance.py два тести з однаковим навантаженням (2000 поповнень і 2000 розрахунків вартості) на мутабельній моделі «до» та незмінній «після».</w:t>
       </w:r>
     </w:p>
     <w:p>
@@ -1037,7 +1100,7 @@
       <w:r>
         <w:drawing>
           <wp:inline xmlns:a="http://schemas.openxmlformats.org/drawingml/2006/main" xmlns:pic="http://schemas.openxmlformats.org/drawingml/2006/picture">
-            <wp:extent cx="5760000" cy="6615446"/>
+            <wp:extent cx="5760000" cy="4109663"/>
             <wp:docPr id="9" name="Picture 9"/>
             <wp:cNvGraphicFramePr>
               <a:graphicFrameLocks noChangeAspect="1"/>
@@ -1046,7 +1109,7 @@
               <a:graphicData uri="http://schemas.openxmlformats.org/drawingml/2006/picture">
                 <pic:pic>
                   <pic:nvPicPr>
-                    <pic:cNvPr id="0" name="app_run.png"/>
+                    <pic:cNvPr id="0" name="tests_test_performance.py.png"/>
                     <pic:cNvPicPr/>
                   </pic:nvPicPr>
                   <pic:blipFill>
@@ -1058,7 +1121,7 @@
                   <pic:spPr>
                     <a:xfrm>
                       <a:off x="0" y="0"/>
-                      <a:ext cx="5760000" cy="6615446"/>
+                      <a:ext cx="5760000" cy="4109663"/>
                     </a:xfrm>
                     <a:prstGeom prst="rect"/>
                   </pic:spPr>
@@ -1081,7 +1144,19 @@
           <w:i/>
           <w:sz w:val="24"/>
         </w:rPr>
-        <w:t>Рис. 9 – Робота програми app.py</w:t>
+        <w:t>Рис. 9 – Тести часу до і після tests/test_performance.py</w:t>
+      </w:r>
+    </w:p>
+    <w:p>
+      <w:pPr>
+        <w:keepNext/>
+        <w:spacing w:after="80"/>
+      </w:pPr>
+      <w:r>
+        <w:rPr>
+          <w:b/>
+        </w:rPr>
+        <w:t>Результат роботи</w:t>
       </w:r>
     </w:p>
     <w:p>
@@ -1091,7 +1166,7 @@
       <w:r>
         <w:drawing>
           <wp:inline xmlns:a="http://schemas.openxmlformats.org/drawingml/2006/main" xmlns:pic="http://schemas.openxmlformats.org/drawingml/2006/picture">
-            <wp:extent cx="5760000" cy="5239892"/>
+            <wp:extent cx="5760000" cy="1816496"/>
             <wp:docPr id="10" name="Picture 10"/>
             <wp:cNvGraphicFramePr>
               <a:graphicFrameLocks noChangeAspect="1"/>
@@ -1100,7 +1175,7 @@
               <a:graphicData uri="http://schemas.openxmlformats.org/drawingml/2006/picture">
                 <pic:pic>
                   <pic:nvPicPr>
-                    <pic:cNvPr id="0" name="pytest_run.png"/>
+                    <pic:cNvPr id="0" name="app_run.png"/>
                     <pic:cNvPicPr/>
                   </pic:nvPicPr>
                   <pic:blipFill>
@@ -1112,7 +1187,7 @@
                   <pic:spPr>
                     <a:xfrm>
                       <a:off x="0" y="0"/>
-                      <a:ext cx="5760000" cy="5239892"/>
+                      <a:ext cx="5760000" cy="1816496"/>
                     </a:xfrm>
                     <a:prstGeom prst="rect"/>
                   </pic:spPr>
@@ -1135,7 +1210,7 @@
           <w:i/>
           <w:sz w:val="24"/>
         </w:rPr>
-        <w:t>Рис. 10 – Результати pytest</w:t>
+        <w:t>Рис. 10 – Робота програми main.py</w:t>
       </w:r>
     </w:p>
     <w:p>
@@ -1145,7 +1220,7 @@
       <w:r>
         <w:drawing>
           <wp:inline xmlns:a="http://schemas.openxmlformats.org/drawingml/2006/main" xmlns:pic="http://schemas.openxmlformats.org/drawingml/2006/picture">
-            <wp:extent cx="5760000" cy="1490458"/>
+            <wp:extent cx="5760000" cy="1109015"/>
             <wp:docPr id="11" name="Picture 11"/>
             <wp:cNvGraphicFramePr>
               <a:graphicFrameLocks noChangeAspect="1"/>
@@ -1166,7 +1241,7 @@
                   <pic:spPr>
                     <a:xfrm>
                       <a:off x="0" y="0"/>
-                      <a:ext cx="5760000" cy="1490458"/>
+                      <a:ext cx="5760000" cy="1109015"/>
                     </a:xfrm>
                     <a:prstGeom prst="rect"/>
                   </pic:spPr>
@@ -1189,7 +1264,7 @@
           <w:i/>
           <w:sz w:val="24"/>
         </w:rPr>
-        <w:t>Рис. 11 – Час тестів pytest --durations=5</w:t>
+        <w:t>Рис. 11 – Порівняння часу pytest --durations=5: «після» швидше завдяки lru_cache</w:t>
       </w:r>
     </w:p>
     <w:p>
@@ -1199,7 +1274,7 @@
       <w:r>
         <w:drawing>
           <wp:inline xmlns:a="http://schemas.openxmlformats.org/drawingml/2006/main" xmlns:pic="http://schemas.openxmlformats.org/drawingml/2006/picture">
-            <wp:extent cx="5760000" cy="2044800"/>
+            <wp:extent cx="5760000" cy="3094925"/>
             <wp:docPr id="12" name="Picture 12"/>
             <wp:cNvGraphicFramePr>
               <a:graphicFrameLocks noChangeAspect="1"/>
@@ -1208,7 +1283,7 @@
               <a:graphicData uri="http://schemas.openxmlformats.org/drawingml/2006/picture">
                 <pic:pic>
                   <pic:nvPicPr>
-                    <pic:cNvPr id="0" name="bench.png"/>
+                    <pic:cNvPr id="0" name="pytest_run.png"/>
                     <pic:cNvPicPr/>
                   </pic:nvPicPr>
                   <pic:blipFill>
@@ -1220,7 +1295,7 @@
                   <pic:spPr>
                     <a:xfrm>
                       <a:off x="0" y="0"/>
-                      <a:ext cx="5760000" cy="2044800"/>
+                      <a:ext cx="5760000" cy="3094925"/>
                     </a:xfrm>
                     <a:prstGeom prst="rect"/>
                   </pic:spPr>
@@ -1243,7 +1318,7 @@
           <w:i/>
           <w:sz w:val="24"/>
         </w:rPr>
-        <w:t>Рис. 12 – Порівняння часу до і після (perf_counter)</w:t>
+        <w:t>Рис. 12 – Результати pytest</w:t>
       </w:r>
     </w:p>
     <w:p>
@@ -1253,7 +1328,7 @@
       <w:r>
         <w:drawing>
           <wp:inline xmlns:a="http://schemas.openxmlformats.org/drawingml/2006/main" xmlns:pic="http://schemas.openxmlformats.org/drawingml/2006/picture">
-            <wp:extent cx="5760000" cy="906822"/>
+            <wp:extent cx="5760000" cy="886154"/>
             <wp:docPr id="13" name="Picture 13"/>
             <wp:cNvGraphicFramePr>
               <a:graphicFrameLocks noChangeAspect="1"/>
@@ -1274,7 +1349,7 @@
                   <pic:spPr>
                     <a:xfrm>
                       <a:off x="0" y="0"/>
-                      <a:ext cx="5760000" cy="906822"/>
+                      <a:ext cx="5760000" cy="886154"/>
                     </a:xfrm>
                     <a:prstGeom prst="rect"/>
                   </pic:spPr>
@@ -1318,7 +1393,7 @@
         <w:jc w:val="both"/>
       </w:pPr>
       <w:r>
-        <w:t>У цій лабораторній роботі я переніс модель складу на незмінні структури: frozen dataclass, NamedTuple, tuple, frozenset і MappingProxyType. Усі оновлення стали чистими — вони повертають нові записи, а старі лишаються без змін, що підтвердили тести. Записи хешовані, тому їх можна використовувати як ключі та кешувати обчислення через lru_cache. Вимірювання показали ціну незмінності: на 2000 послідовних оновлень незмінна версія повільніша (≈20 мс проти ≈0,65 мс), головно через копіювання кортежу історії рухів, але для реальних обсягів це мілісекунди, а надійність і передбачуваність коду суттєво зросли.</w:t>
+        <w:t>Під час виконання лабораторної роботи я перевів мутабельну модель складу (варіант 4) на незмінну: Product і StockRecord як frozen dataclass зі slots, партії у tuple, теги у frozenset, метадані постачальника у MappingProxyType над копією джерела. Усі оновлення реалізовано як чисті функції, що повертають нові копії через dataclasses.replace; хешованість запису дозволила кешувати розрахунок вартості через lru_cache і використовувати запис як ключ словника. Тести підтвердили відсутність мутацій і read-only поведінку, а порівняння часу показало, що незмінна модель завдяки кешуванню виконує навантаження швидше (≈0,01 с проти ≈0,05 с); накладні витрати — копіювання колекцій при кожному оновленні та захист лише верхнього рівня у proxy.</w:t>
       </w:r>
     </w:p>
     <w:sectPr>

</xml_diff>